<commit_message>
[Docs] Additional goals README & Report
- 리드미 & 리포트 추가과제 구현 부분
- 코드에서 주석 일부 제거
</commit_message>
<xml_diff>
--- a/Docs/Assn4 Report.docx
+++ b/Docs/Assn4 Report.docx
@@ -40,7 +40,7 @@
           <w:sz w:val="36"/>
           <w:szCs w:val="36"/>
         </w:rPr>
-        <w:t>3-</w:t>
+        <w:t>4</w:t>
       </w:r>
       <w:r>
         <w:rPr>
@@ -50,16 +50,6 @@
           <w:sz w:val="36"/>
           <w:szCs w:val="36"/>
         </w:rPr>
-        <w:t>2</w:t>
-      </w:r>
-      <w:r>
-        <w:rPr>
-          <w:rFonts w:hint="eastAsia"/>
-          <w:b/>
-          <w:bCs/>
-          <w:sz w:val="36"/>
-          <w:szCs w:val="36"/>
-        </w:rPr>
         <w:t xml:space="preserve"> Report</w:t>
       </w:r>
     </w:p>
@@ -238,128 +228,203 @@
           <w:szCs w:val="22"/>
         </w:rPr>
       </w:pPr>
-      <w:r>
-        <w:rPr>
-          <w:szCs w:val="22"/>
-        </w:rPr>
-        <w:t>Assignment3-1은 Assignment1, Assignment2, Assignment3-1에서 구현했던 Bullet Hell shooter의 모든 기능들 및 그래픽을 유지하면서, OpenGL legacy pipeline을 모두 OpenGL Shader Language로 교체하는 것이 주 목표이다. 플레이어, 적, bullet 등 텍스트를 제외한 모든 엔티티가 GLSL로 표현되었으며, 제공된 assets 파일의 3D 모델들을 적극적으로 활용했다. 이</w:t>
-      </w:r>
-      <w:r>
-        <w:rPr>
-          <w:rFonts w:hint="eastAsia"/>
-          <w:szCs w:val="22"/>
-        </w:rPr>
-        <w:t>를</w:t>
-      </w:r>
-      <w:r>
-        <w:rPr>
-          <w:szCs w:val="22"/>
-        </w:rPr>
-        <w:t xml:space="preserve"> 위해 Shader 클래스와 shader.vs, </w:t>
-      </w:r>
-      <w:proofErr w:type="gramStart"/>
-      <w:r>
-        <w:rPr>
-          <w:szCs w:val="22"/>
-        </w:rPr>
-        <w:t>shader.fs</w:t>
-      </w:r>
-      <w:proofErr w:type="gramEnd"/>
-      <w:r>
-        <w:rPr>
-          <w:szCs w:val="22"/>
-        </w:rPr>
-        <w:t xml:space="preserve"> 파일을 추가했으며, 기존의 Model 클래스를 VAO와 VBO를 사용하는 방식으로 변경했다.</w:t>
-      </w:r>
-    </w:p>
-    <w:p>
-      <w:pPr>
-        <w:ind w:firstLineChars="100" w:firstLine="220"/>
-        <w:rPr>
-          <w:szCs w:val="22"/>
-        </w:rPr>
-      </w:pPr>
-      <w:r>
-        <w:rPr>
-          <w:szCs w:val="22"/>
-        </w:rPr>
-        <w:t>glm 라이브러리를 include하여 기존 OpenGL legacy pipeline 방식 대신, 직접 모든 행렬을 계산할 수 있도록 환경을 세팅했다. 변환 행렬은 4x4행렬로 저장되어, 전역변수로 프로그램 전체에서 변경될 수 있으며 적절히 사용된다. 이에 따라 기존 draw함수들과, 그래픽 스타일 및 카메라 뷰 설정 함수들을 적절히 변경했다.</w:t>
-      </w:r>
-    </w:p>
-    <w:p>
-      <w:pPr>
-        <w:ind w:firstLineChars="100" w:firstLine="220"/>
-        <w:rPr>
-          <w:szCs w:val="22"/>
-        </w:rPr>
-      </w:pPr>
-      <w:r>
-        <w:rPr>
-          <w:szCs w:val="22"/>
-        </w:rPr>
-        <w:t>Q키를 눌러 그래픽 스타일을 바꿀 수 있다. 이번 과제에서는 기존에 구현되어 있던 opaque polygon style과 wireframe style 두 가지 그래픽 스타일에 더해, wireframe style with hidden line removal을 구현한다. 이를 위해 setGraphicStyleThenRender라는 함수를 추가하여 currentGraphicStyle이라는 변수에 따라 그래픽 스타일을 바꾸도록 했으며, 이 함수에서 렌더링까지 진</w:t>
-      </w:r>
-      <w:r>
-        <w:rPr>
-          <w:rFonts w:hint="eastAsia"/>
-          <w:szCs w:val="22"/>
-        </w:rPr>
-        <w:t>행한다</w:t>
-      </w:r>
-      <w:r>
-        <w:rPr>
-          <w:szCs w:val="22"/>
-        </w:rPr>
-        <w:t xml:space="preserve">. 이를 위한 관련 키 상호작용을handleKeyDown 함수에 </w:t>
-      </w:r>
-      <w:r>
-        <w:rPr>
+    </w:p>
+    <w:p>
+      <w:pPr>
+        <w:rPr>
+          <w:rFonts w:hint="eastAsia"/>
+          <w:b/>
+          <w:bCs/>
+          <w:sz w:val="24"/>
+        </w:rPr>
+      </w:pPr>
+      <w:r>
+        <w:rPr>
+          <w:rFonts w:hint="eastAsia"/>
+          <w:b/>
+          <w:bCs/>
+          <w:sz w:val="24"/>
+        </w:rPr>
+        <w:t>2-2. Additional Requirements</w:t>
+      </w:r>
+    </w:p>
+    <w:p>
+      <w:pPr>
+        <w:rPr>
+          <w:szCs w:val="22"/>
+        </w:rPr>
+      </w:pPr>
+      <w:r>
+        <w:rPr>
+          <w:rFonts w:hint="eastAsia"/>
+          <w:szCs w:val="22"/>
+        </w:rPr>
+        <w:t xml:space="preserve">- </w:t>
+      </w:r>
+      <w:r>
+        <w:rPr>
+          <w:rFonts w:hint="eastAsia"/>
+          <w:szCs w:val="22"/>
+        </w:rPr>
+        <w:t>Multiple point light sources</w:t>
+      </w:r>
+    </w:p>
+    <w:p>
+      <w:pPr>
+        <w:rPr>
+          <w:szCs w:val="22"/>
+        </w:rPr>
+      </w:pPr>
+      <w:r>
+        <w:rPr>
+          <w:rFonts w:hint="eastAsia"/>
+          <w:szCs w:val="22"/>
+        </w:rPr>
+        <w:t xml:space="preserve"> fragment shader에서 PointLight 구조체를 담는 pointLights 배열을 선언한다. </w:t>
+      </w:r>
+      <w:r>
+        <w:rPr>
+          <w:szCs w:val="22"/>
+        </w:rPr>
+        <w:t>A</w:t>
+      </w:r>
+      <w:r>
+        <w:rPr>
+          <w:rFonts w:hint="eastAsia"/>
+          <w:szCs w:val="22"/>
+        </w:rPr>
+        <w:t>ssn4의 minimum goal과 달리 point light를 4개 사용하기 때문에, for문을 이용하여 각각의 point light 조명 계산을 한다. 이후 코드의 display 함수에서 조명의 위치, 색깔 등을 포함한 조명 4개의 정보들을 fragment shader로 전송한다. 또한 assn4의 다른 minimum goal인 gouraud shading의 경우 빛 계산이 vertex shader에서 관리되므로, vertex shader에도 fragment shader에서처럼 PointLight 구조체들을 담는 pointLights 배열 선언, for문을 이용한 빛 계산을 적용해주면 최종적으로 multiple point light sources를 구현할 수 있다.</w:t>
+      </w:r>
+    </w:p>
+    <w:p>
+      <w:pPr>
+        <w:rPr>
+          <w:szCs w:val="22"/>
+        </w:rPr>
+      </w:pPr>
+    </w:p>
+    <w:p>
+      <w:pPr>
+        <w:rPr>
+          <w:szCs w:val="22"/>
+        </w:rPr>
+      </w:pPr>
+      <w:r>
+        <w:rPr>
+          <w:rFonts w:hint="eastAsia"/>
+          <w:szCs w:val="22"/>
+        </w:rPr>
+        <w:t>- Planar shadow casting</w:t>
+      </w:r>
+    </w:p>
+    <w:p>
+      <w:pPr>
+        <w:rPr>
+          <w:szCs w:val="22"/>
+        </w:rPr>
+      </w:pPr>
+      <w:r>
+        <w:rPr>
+          <w:rFonts w:hint="eastAsia"/>
           <w:szCs w:val="22"/>
         </w:rPr>
         <w:lastRenderedPageBreak/>
-        <w:t>구현했다.</w:t>
-      </w:r>
-    </w:p>
-    <w:p>
-      <w:pPr>
-        <w:ind w:firstLineChars="100" w:firstLine="220"/>
-        <w:rPr>
-          <w:szCs w:val="22"/>
-        </w:rPr>
-      </w:pPr>
-      <w:r>
-        <w:rPr>
-          <w:szCs w:val="22"/>
-        </w:rPr>
-        <w:t xml:space="preserve">3D 그래픽 방식과 다양한 카메라 뷰 추가로 인해, 기존에 사용하던 윈도우 창을 제한 구역으로 하기에는 플레이어가 이동 제한 구역을 잘 인지하지 못한다는 문제가 발생한다. 따라서 과제 문서에 따라 플레이어가 움직일 수 있는 공간인 bounding box를 구현하였으며, 노란색 선으로 구역을 잘 보이게 하였다. 이 bounding box 또한 씬 그래프에 의해 노드로 관리되어 그려진다. Bullet들도 이 bounding box 외부로 이동하면 사라진다. </w:t>
-      </w:r>
-      <w:r>
-        <w:rPr>
-          <w:rFonts w:hint="eastAsia"/>
-          <w:szCs w:val="22"/>
-        </w:rPr>
-        <w:t>이</w:t>
-      </w:r>
-      <w:r>
-        <w:rPr>
-          <w:szCs w:val="22"/>
-        </w:rPr>
-        <w:t xml:space="preserve"> bounding box에도 VAO를 적용하였고, 그 기능은 InitBoundingBox 함수가 맡는다.</w:t>
-      </w:r>
-    </w:p>
-    <w:p>
-      <w:pPr>
-        <w:ind w:firstLineChars="100" w:firstLine="220"/>
-        <w:rPr>
-          <w:rFonts w:hint="eastAsia"/>
-          <w:szCs w:val="22"/>
-        </w:rPr>
-      </w:pPr>
-    </w:p>
-    <w:p>
-      <w:pPr>
-        <w:rPr>
-          <w:rFonts w:hint="eastAsia"/>
+        <w:t xml:space="preserve"> 배경이 검정색이므로 그림자는 회색으로 그린다. fragment shader에 isShadow bool 타입 변수를 추가하여, 그림자를 그릴 때와 아닐 때를 구분시킨다. 코드에서는 그림자를 그리는 전용 조명을 추가하여, z = -1.0 plane에 그림자가 평면으로 그려지도록 하였다. 그림자들을 그리기 위한 행렬은 generateShadow</w:t>
+      </w:r>
+      <w:r>
+        <w:rPr>
+          <w:szCs w:val="22"/>
+        </w:rPr>
+        <w:tab/>
+      </w:r>
+      <w:r>
+        <w:rPr>
+          <w:rFonts w:hint="eastAsia"/>
+          <w:szCs w:val="22"/>
+        </w:rPr>
+        <w:t xml:space="preserve">Matrix 함수에서 만들어진다. </w:t>
+      </w:r>
+      <w:r>
+        <w:rPr>
+          <w:rFonts w:hint="eastAsia"/>
+          <w:szCs w:val="22"/>
+        </w:rPr>
+        <w:t>generateShadowMatrix 함수에서는 조명 위치와 바닥 평면으로 projection matrix를 생성하는 방식으로 행렬을 만들어낸다. 또한 기존 setGraphicStyleThenRender 함수의 앞부분에서 그림자를 그리도록 한다. 그림자의 경우 3D가 아니라 평면이기 때문에, 그림자를 그릴 때에 한해 깊이 버퍼를 끈다. 그림자를 그릴 때와 아닐 때를 isShadow bool타입 변수로 구분하여 이를 가능하게 하였다. 이렇게 그려지는 그림자는, 코드에서 조명 위치를 변경하여 크기와 위치를 적절히 조절할 수 있다.</w:t>
+      </w:r>
+    </w:p>
+    <w:p>
+      <w:pPr>
+        <w:rPr>
+          <w:szCs w:val="22"/>
+        </w:rPr>
+      </w:pPr>
+    </w:p>
+    <w:p>
+      <w:pPr>
+        <w:rPr>
+          <w:szCs w:val="22"/>
+        </w:rPr>
+      </w:pPr>
+      <w:r>
+        <w:rPr>
+          <w:rFonts w:hint="eastAsia"/>
+          <w:szCs w:val="22"/>
+        </w:rPr>
+        <w:t>- Spotlight</w:t>
+      </w:r>
+    </w:p>
+    <w:p>
+      <w:pPr>
+        <w:rPr>
+          <w:rFonts w:hint="eastAsia"/>
+          <w:szCs w:val="22"/>
+        </w:rPr>
+      </w:pPr>
+      <w:r>
+        <w:rPr>
+          <w:rFonts w:hint="eastAsia"/>
+          <w:szCs w:val="22"/>
+        </w:rPr>
+        <w:t xml:space="preserve"> fragment shader에 SpotLight 구조체를 추가한다. 이 구조체는 기본적으로 PointLight가 가지고 있는 모든 변수들에 더하여 vec3 direction, float CutOff, float OuterCutOff를 추가적으로 가진다. direction은 스포트라이트를 비추는 방향, CutOff는 스포트라이트가 비추는 범위, OuterCutOff는 자연스러워 보이게 하기 위해 스포트라이트에서 비춰지는 빛이 흐려지는 범위를 의미한다. SpotLight 계산의 기본 골자는 PointLight 계산과 동일하나, theta, </w:t>
+      </w:r>
+      <w:r>
+        <w:rPr>
+          <w:szCs w:val="22"/>
+        </w:rPr>
+        <w:t>epsilon</w:t>
+      </w:r>
+      <w:r>
+        <w:rPr>
+          <w:rFonts w:hint="eastAsia"/>
+          <w:szCs w:val="22"/>
+        </w:rPr>
+        <w:t>, intensity를 추가적으로 계산하여 스포트라이트를 비출 각도를 계산한다. 이 계산 과정은 fragment shader에 존재하는 calcSpotLight 함수에서 이루어진다.</w:t>
+      </w:r>
+      <w:r>
+        <w:rPr>
+          <w:rFonts w:hint="eastAsia"/>
+          <w:szCs w:val="22"/>
+        </w:rPr>
+        <w:t xml:space="preserve"> 그 후 </w:t>
+      </w:r>
+      <w:r>
+        <w:rPr>
+          <w:rFonts w:hint="eastAsia"/>
+          <w:szCs w:val="22"/>
+        </w:rPr>
+        <w:t xml:space="preserve">코드에서 스포트라이트 정보를 쉐이더로 넘겨준 후, </w:t>
+      </w:r>
+      <w:r>
+        <w:rPr>
+          <w:rFonts w:hint="eastAsia"/>
+          <w:szCs w:val="22"/>
+        </w:rPr>
+        <w:t>마지막으로 main함수에서 result에 스포트라이트 빛을 더해주면 스포트라이트 구현이 완료되고, 플레이어 비행기의 앞부분은 더 선명하게 보이게 된다.</w:t>
+      </w:r>
+    </w:p>
+    <w:p>
+      <w:pPr>
+        <w:rPr>
           <w:b/>
           <w:bCs/>
           <w:sz w:val="24"/>
@@ -372,382 +437,12 @@
           <w:bCs/>
           <w:sz w:val="24"/>
         </w:rPr>
-        <w:t>2-2. Additional Requirements</w:t>
-      </w:r>
-    </w:p>
-    <w:p>
-      <w:pPr>
-        <w:rPr>
-          <w:szCs w:val="22"/>
-        </w:rPr>
-      </w:pPr>
-      <w:r>
-        <w:rPr>
-          <w:rFonts w:hint="eastAsia"/>
-          <w:szCs w:val="22"/>
-        </w:rPr>
-        <w:t xml:space="preserve">- </w:t>
-      </w:r>
-      <w:r>
-        <w:rPr>
-          <w:rFonts w:hint="eastAsia"/>
-          <w:szCs w:val="22"/>
-        </w:rPr>
-        <w:t>적 색과 HP 연동</w:t>
-      </w:r>
-    </w:p>
-    <w:p>
-      <w:pPr>
-        <w:rPr>
-          <w:szCs w:val="22"/>
-        </w:rPr>
-      </w:pPr>
-      <w:r>
-        <w:rPr>
-          <w:rFonts w:hint="eastAsia"/>
-          <w:szCs w:val="22"/>
-        </w:rPr>
-        <w:t xml:space="preserve"> Enemy 객체의 health와 maxHealth 값을 가져와 현재 남은 체력의 비율을 계산하고, 선형 보간 함수 lerp를 사용해 healthyColor와 damagedColor 사이에서 비율에 맞는 중간 색을 계산한다. 함수에 의해 반환된 색상 값을 적의 color 속성에 덮어씌워서 HP의 변화를 색깔로 인지할 수 있도록 한다.</w:t>
-      </w:r>
-    </w:p>
-    <w:p>
-      <w:pPr>
-        <w:rPr>
-          <w:szCs w:val="22"/>
-        </w:rPr>
-      </w:pPr>
-    </w:p>
-    <w:p>
-      <w:pPr>
-        <w:rPr>
-          <w:szCs w:val="22"/>
-        </w:rPr>
-      </w:pPr>
-      <w:r>
-        <w:rPr>
-          <w:rFonts w:hint="eastAsia"/>
-          <w:szCs w:val="22"/>
-        </w:rPr>
-        <w:t>- 적의 플레이어 타겟팅</w:t>
-      </w:r>
-    </w:p>
-    <w:p>
-      <w:pPr>
-        <w:rPr>
-          <w:szCs w:val="22"/>
-        </w:rPr>
-      </w:pPr>
-      <w:r>
-        <w:rPr>
-          <w:rFonts w:hint="eastAsia"/>
-          <w:szCs w:val="22"/>
-        </w:rPr>
-        <w:t xml:space="preserve"> </w:t>
-      </w:r>
-      <w:proofErr w:type="gramStart"/>
-      <w:r>
-        <w:rPr>
-          <w:rFonts w:hint="eastAsia"/>
-          <w:szCs w:val="22"/>
-        </w:rPr>
-        <w:t>Enemy::</w:t>
-      </w:r>
-      <w:proofErr w:type="gramEnd"/>
-      <w:r>
-        <w:rPr>
-          <w:rFonts w:hint="eastAsia"/>
-          <w:szCs w:val="22"/>
-        </w:rPr>
-        <w:t xml:space="preserve">update 함수에서 매 프레임마다 적의 현재 위치를 기반으로 플레이어와의 x, y 좌표의 차이를 계산한다. 그 후 atan2 함수를 통해 적이 플레이어를 향하는 벡터의 각도를 계산하고, </w:t>
-      </w:r>
-      <w:r>
-        <w:rPr>
-          <w:rFonts w:hint="eastAsia"/>
-          <w:szCs w:val="22"/>
-        </w:rPr>
-        <w:t>Enemy 구조체 내의 targetAngle에 저장한다. 적을 실제로 그리는 updateSceneGraph 함수에서 enemyNode-&gt;</w:t>
-      </w:r>
-      <w:proofErr w:type="gramStart"/>
-      <w:r>
-        <w:rPr>
-          <w:rFonts w:hint="eastAsia"/>
-          <w:szCs w:val="22"/>
-        </w:rPr>
-        <w:t>rot.y</w:t>
-      </w:r>
-      <w:proofErr w:type="gramEnd"/>
-      <w:r>
-        <w:rPr>
-          <w:rFonts w:hint="eastAsia"/>
-          <w:szCs w:val="22"/>
-        </w:rPr>
-        <w:t>에 해당 각도를 대입하여 drawRecursive가 해당 노드를 그릴 때 플레이어를 향한 방향으로 정렬되게 구현하였다.</w:t>
-      </w:r>
-    </w:p>
-    <w:p>
-      <w:pPr>
-        <w:rPr>
-          <w:szCs w:val="22"/>
-        </w:rPr>
-      </w:pPr>
-    </w:p>
-    <w:p>
-      <w:pPr>
-        <w:rPr>
-          <w:szCs w:val="22"/>
-        </w:rPr>
-      </w:pPr>
-      <w:r>
-        <w:rPr>
-          <w:rFonts w:hint="eastAsia"/>
-          <w:szCs w:val="22"/>
-        </w:rPr>
-        <w:t>- 플레이어 총알 명중 파티클</w:t>
-      </w:r>
-    </w:p>
-    <w:p>
-      <w:pPr>
-        <w:rPr>
-          <w:szCs w:val="22"/>
-        </w:rPr>
-      </w:pPr>
-      <w:r>
-        <w:rPr>
-          <w:rFonts w:hint="eastAsia"/>
-          <w:szCs w:val="22"/>
-        </w:rPr>
-        <w:t xml:space="preserve"> handleCollision 함수가 플레이어 총알과 적의 충돌을 감지한 순간에 총알이 맞은 위치에서 8개 방향으로 작은 노란색 파티클이 퍼져나가도록 한다. 이를 위해 위치, 속도, 생존 시간과 색깔 인자를 가지는 구조체 Particle을 새롭게 추가한다.</w:t>
-      </w:r>
-    </w:p>
-    <w:p>
-      <w:pPr>
-        <w:rPr>
-          <w:rFonts w:hint="eastAsia"/>
-          <w:szCs w:val="22"/>
-        </w:rPr>
-      </w:pPr>
-      <w:r>
-        <w:rPr>
-          <w:rFonts w:hint="eastAsia"/>
-          <w:szCs w:val="22"/>
-        </w:rPr>
-        <w:t xml:space="preserve"> 생성 함수 bulletParticleEffect는 파티클을 생성할 피격 위치 x, y를 인자로 받으며, 이를 기준으로 8방향으로 퍼져나가는 원형 파티클들을 생성해 velocity와 lifetime을 할당한다. 이 때 lifetime에는 rand()를 통한 약간의 랜덤성을 부여해 연출의 생동감을 부여한다. 생성된 파티클은 particle</w:t>
-      </w:r>
-      <w:r>
-        <w:rPr>
-          <w:rFonts w:hint="eastAsia"/>
-          <w:szCs w:val="22"/>
-        </w:rPr>
-        <w:t>NodePool</w:t>
-      </w:r>
-      <w:r>
-        <w:rPr>
-          <w:rFonts w:hint="eastAsia"/>
-          <w:szCs w:val="22"/>
-        </w:rPr>
-        <w:t>에 저장되</w:t>
-      </w:r>
-      <w:r>
-        <w:rPr>
-          <w:rFonts w:hint="eastAsia"/>
-          <w:szCs w:val="22"/>
-        </w:rPr>
-        <w:t>며</w:t>
-      </w:r>
-      <w:r>
-        <w:rPr>
-          <w:rFonts w:hint="eastAsia"/>
-          <w:szCs w:val="22"/>
-        </w:rPr>
-        <w:t xml:space="preserve">, </w:t>
-      </w:r>
-      <w:r>
-        <w:rPr>
-          <w:rFonts w:hint="eastAsia"/>
-          <w:szCs w:val="22"/>
-        </w:rPr>
-        <w:t>updateParciels에 의해 관리된다.</w:t>
-      </w:r>
-    </w:p>
-    <w:p>
-      <w:pPr>
-        <w:rPr>
-          <w:szCs w:val="22"/>
-        </w:rPr>
-      </w:pPr>
-      <w:r>
-        <w:rPr>
-          <w:rFonts w:hint="eastAsia"/>
-          <w:szCs w:val="22"/>
-        </w:rPr>
-        <w:lastRenderedPageBreak/>
-        <w:t xml:space="preserve"> updateParticles는 timer에 의해 호출되어 매 프레임마다 particles 속 파티클들의 위치를 속도를 기반으로 갱신하고, 생존 시간을 감소시키다가 수명이 다할 경우 삭제한다. </w:t>
-      </w:r>
-      <w:r>
-        <w:rPr>
-          <w:rFonts w:hint="eastAsia"/>
-          <w:szCs w:val="22"/>
-        </w:rPr>
-        <w:t xml:space="preserve">3-1의 구현에서는 함수 </w:t>
-      </w:r>
-      <w:r>
-        <w:rPr>
-          <w:rFonts w:hint="eastAsia"/>
-          <w:szCs w:val="22"/>
-        </w:rPr>
-        <w:t>drawParticleEffect</w:t>
-      </w:r>
-      <w:r>
-        <w:rPr>
-          <w:rFonts w:hint="eastAsia"/>
-          <w:szCs w:val="22"/>
-        </w:rPr>
-        <w:t>를 사용해 파티클 효과를 그렸지만, 이번에는 다른 오브젝트들과 마찬가지로 Node 속 순회에 의해 접근하여 그린다.</w:t>
-      </w:r>
-    </w:p>
-    <w:p>
-      <w:pPr>
-        <w:rPr>
-          <w:szCs w:val="22"/>
-        </w:rPr>
-      </w:pPr>
-    </w:p>
-    <w:p>
-      <w:pPr>
-        <w:rPr>
-          <w:szCs w:val="22"/>
-        </w:rPr>
-      </w:pPr>
-      <w:r>
-        <w:rPr>
-          <w:rFonts w:hint="eastAsia"/>
-          <w:szCs w:val="22"/>
-        </w:rPr>
-        <w:t>- 플레이어 추진 파티클</w:t>
-      </w:r>
-    </w:p>
-    <w:p>
-      <w:pPr>
-        <w:rPr>
-          <w:szCs w:val="22"/>
-        </w:rPr>
-      </w:pPr>
-      <w:r>
-        <w:rPr>
-          <w:rFonts w:hint="eastAsia"/>
-          <w:szCs w:val="22"/>
-        </w:rPr>
-        <w:t xml:space="preserve"> 플레이어가 W키를 통해 앞으로 추진할 때 기체 뒤쪽에서 파티클이 분출되도록 한다. 이 파티클들은 boostParticleEffect 함수를 통해 생성되며, processInput의 'w' 입력 인식 부분에서 호출된다. 플레이어 제트기 모델의 후방 위치에서 1~2개의 파티클을 생성해 particles에 추가하고, 파티클의 속도는 플레이어의 뒤쪽을 향하되 마찬가지로 rand()를 통해 약간의 랜덤성을 준다. 파티클의 관리는 위의 총알 명중 효과와 동일한 함수들에 의해 처리된다.</w:t>
-      </w:r>
-    </w:p>
-    <w:p>
-      <w:pPr>
-        <w:rPr>
-          <w:szCs w:val="22"/>
-        </w:rPr>
-      </w:pPr>
-    </w:p>
-    <w:p>
-      <w:pPr>
-        <w:rPr>
-          <w:szCs w:val="22"/>
-        </w:rPr>
-      </w:pPr>
-      <w:r>
-        <w:rPr>
-          <w:rFonts w:hint="eastAsia"/>
-          <w:szCs w:val="22"/>
-        </w:rPr>
-        <w:t>- 적 주위 공전 엔티티</w:t>
-      </w:r>
-    </w:p>
-    <w:p>
-      <w:pPr>
-        <w:rPr>
-          <w:szCs w:val="22"/>
-        </w:rPr>
-      </w:pPr>
-      <w:r>
-        <w:rPr>
-          <w:rFonts w:hint="eastAsia"/>
-          <w:szCs w:val="22"/>
-        </w:rPr>
-        <w:t xml:space="preserve"> 게임의 3D 입체감을 조금 더 살릴 수 있도록, 적의 주위를 공전하는 엔티티를 구현하여 게임이 단순 평면만을 그리고 있는 것이 아님을 강조하였다. </w:t>
-      </w:r>
-      <w:r>
-        <w:rPr>
-          <w:rFonts w:hint="eastAsia"/>
-          <w:szCs w:val="22"/>
-        </w:rPr>
-        <w:t>이를 위해 씬 그래프의 관계에서 적의 자식에 새로운 노드를 추가하였고, main 함수에서 이를 위한 enemyOrbitNodePool을 생성하였다.</w:t>
-      </w:r>
-    </w:p>
-    <w:p>
-      <w:pPr>
-        <w:rPr>
-          <w:szCs w:val="22"/>
-        </w:rPr>
-      </w:pPr>
-      <w:r>
-        <w:rPr>
-          <w:rFonts w:hint="eastAsia"/>
-          <w:szCs w:val="22"/>
-        </w:rPr>
-        <w:t xml:space="preserve"> updateSceneGraph 함수에서 enemyNode를</w:t>
-      </w:r>
-      <w:r>
-        <w:rPr>
-          <w:rFonts w:hint="eastAsia"/>
-          <w:szCs w:val="22"/>
-        </w:rPr>
-        <w:t xml:space="preserve"> enemiesGrounNode에 추가하기 전에 enemyOrbitNodePool에서 </w:t>
-      </w:r>
-      <w:r>
-        <w:rPr>
-          <w:rFonts w:hint="eastAsia"/>
-          <w:szCs w:val="22"/>
-        </w:rPr>
-        <w:t>공전 엔티티</w:t>
-      </w:r>
-      <w:r>
-        <w:rPr>
-          <w:rFonts w:hint="eastAsia"/>
-          <w:szCs w:val="22"/>
-        </w:rPr>
-        <w:t xml:space="preserve"> 노드를 가져와 children.push_back()</w:t>
-      </w:r>
-      <w:r>
-        <w:rPr>
-          <w:szCs w:val="22"/>
-        </w:rPr>
-        <w:t>으로</w:t>
-      </w:r>
-      <w:r>
-        <w:rPr>
-          <w:rFonts w:hint="eastAsia"/>
-          <w:szCs w:val="22"/>
-        </w:rPr>
-        <w:t xml:space="preserve"> enemyNode의 자식으로 추가하고, glutGet(GLUT_ELAPSED_TIME)을 인자로 삼각함수를 호출해 </w:t>
-      </w:r>
-      <w:r>
-        <w:rPr>
-          <w:rFonts w:hint="eastAsia"/>
-          <w:szCs w:val="22"/>
-        </w:rPr>
-        <w:t>공전 엔티티들의 x, y좌표에 대입하였다. 이를 통해 평면을 뚫고 각 enemyNode의 로컬 XY 평면을 공전하는 4개의 구체를 구현하였다.</w:t>
-      </w:r>
-    </w:p>
-    <w:p>
-      <w:pPr>
-        <w:rPr>
-          <w:szCs w:val="22"/>
-        </w:rPr>
-      </w:pPr>
-    </w:p>
-    <w:p>
-      <w:pPr>
-        <w:rPr>
-          <w:rFonts w:hint="eastAsia"/>
+        <w:t>2-3. Design Rationale</w:t>
+      </w:r>
+    </w:p>
+    <w:p>
+      <w:pPr>
+        <w:rPr>
           <w:szCs w:val="22"/>
         </w:rPr>
       </w:pPr>
@@ -767,459 +462,40 @@
           <w:bCs/>
           <w:sz w:val="24"/>
         </w:rPr>
-        <w:t>2-3. Design Rationale</w:t>
-      </w:r>
-    </w:p>
-    <w:p>
-      <w:pPr>
-        <w:rPr>
-          <w:szCs w:val="22"/>
-        </w:rPr>
-      </w:pPr>
-      <w:r>
-        <w:rPr>
-          <w:rFonts w:hint="eastAsia"/>
-          <w:szCs w:val="22"/>
-        </w:rPr>
-        <w:t xml:space="preserve"> </w:t>
-      </w:r>
-      <w:r>
-        <w:rPr>
-          <w:rFonts w:hint="eastAsia"/>
-          <w:szCs w:val="22"/>
-        </w:rPr>
-        <w:t>이번</w:t>
-      </w:r>
-      <w:r>
-        <w:rPr>
-          <w:szCs w:val="22"/>
-        </w:rPr>
-        <w:t xml:space="preserve"> 과제에서는 OpenGL legacy pipeline 대신 GLSL을 사용하여 쉐이더와 VAO, VBO 개념을 도입하였다. GPU를 사용하게 됨으로써 이후 최적화 및 더 많고 복잡한 모델들 그리기를 기대할 수 있게 되었다. 이번 과제에서 추가되거나 변경된 사항은 다음과 같다.</w:t>
-      </w:r>
-    </w:p>
-    <w:p>
-      <w:pPr>
-        <w:rPr>
-          <w:szCs w:val="22"/>
-        </w:rPr>
-      </w:pPr>
-      <w:r>
-        <w:rPr>
-          <w:szCs w:val="22"/>
-        </w:rPr>
-        <w:t>1) GLSL 도입: vertex shader, fragment shader, Shader 클래스를 구현했고 .vs</w:t>
-      </w:r>
-      <w:proofErr w:type="gramStart"/>
-      <w:r>
-        <w:rPr>
-          <w:szCs w:val="22"/>
-        </w:rPr>
-        <w:t>, .fs</w:t>
-      </w:r>
-      <w:proofErr w:type="gramEnd"/>
-      <w:r>
-        <w:rPr>
-          <w:szCs w:val="22"/>
-        </w:rPr>
-        <w:t xml:space="preserve"> 파일을 </w:t>
-      </w:r>
-      <w:r>
-        <w:rPr>
-          <w:szCs w:val="22"/>
-        </w:rPr>
-        <w:lastRenderedPageBreak/>
-        <w:t>로드하여 사용한다. VAO, VBO를 사용하여 행렬을 포함한 데이터들을 GPU로 보낸다. 또한 GLSL을 사용함으로써, 기존 glBegin 등의 OpenGL legacy pipeline을 사용하는 코드들을 삭제했다.</w:t>
-      </w:r>
-    </w:p>
-    <w:p>
-      <w:pPr>
-        <w:rPr>
-          <w:szCs w:val="22"/>
-        </w:rPr>
-      </w:pPr>
-    </w:p>
-    <w:p>
-      <w:pPr>
-        <w:rPr>
+        <w:t>2-4. Design Implementation</w:t>
+      </w:r>
+    </w:p>
+    <w:p>
+      <w:pPr>
+        <w:rPr>
+          <w:rFonts w:hint="eastAsia"/>
           <w:b/>
           <w:bCs/>
           <w:sz w:val="24"/>
         </w:rPr>
       </w:pPr>
-      <w:r>
-        <w:rPr>
-          <w:rFonts w:hint="eastAsia"/>
+    </w:p>
+    <w:p>
+      <w:pPr>
+        <w:rPr>
           <w:b/>
           <w:bCs/>
           <w:sz w:val="24"/>
         </w:rPr>
-        <w:t>2-4. Design Implementation</w:t>
-      </w:r>
-    </w:p>
-    <w:p>
-      <w:pPr>
-        <w:rPr>
-          <w:szCs w:val="22"/>
-        </w:rPr>
-      </w:pPr>
-      <w:r>
-        <w:rPr>
-          <w:rFonts w:hint="eastAsia"/>
-          <w:szCs w:val="22"/>
-        </w:rPr>
-        <w:t xml:space="preserve"> </w:t>
-      </w:r>
-      <w:r>
-        <w:rPr>
-          <w:szCs w:val="22"/>
-        </w:rPr>
-        <w:t>Shader 클래스에서는 .vs</w:t>
-      </w:r>
-      <w:proofErr w:type="gramStart"/>
-      <w:r>
-        <w:rPr>
-          <w:szCs w:val="22"/>
-        </w:rPr>
-        <w:t>, .fs</w:t>
-      </w:r>
-      <w:proofErr w:type="gramEnd"/>
-      <w:r>
-        <w:rPr>
-          <w:szCs w:val="22"/>
-        </w:rPr>
-        <w:t xml:space="preserve"> 확장자 파일을 읽어온 후, 쉐이더를 컴파일하고, 쉐이더와 프로그램 링크한다. 또한 use, setMat4, setVec3 함수들을 선언하여 쉐이더 활성화와 uniform 변수 위치 검색 및 값 할당을 편하게 할 수 있게 구현했다. 전역변수로 쉐이더 포인터를 추가하고, main함수 내부에서 쉐이더를 로드하여 활성화시킨다.</w:t>
-      </w:r>
-    </w:p>
-    <w:p>
-      <w:pPr>
-        <w:rPr>
-          <w:szCs w:val="22"/>
-        </w:rPr>
-      </w:pPr>
-      <w:r>
-        <w:rPr>
-          <w:rFonts w:hint="eastAsia"/>
-          <w:szCs w:val="22"/>
-        </w:rPr>
-        <w:t xml:space="preserve"> </w:t>
-      </w:r>
-      <w:r>
-        <w:rPr>
-          <w:rFonts w:hint="eastAsia"/>
-          <w:szCs w:val="22"/>
-        </w:rPr>
-        <w:t>기존의</w:t>
-      </w:r>
-      <w:r>
-        <w:rPr>
-          <w:szCs w:val="22"/>
-        </w:rPr>
-        <w:t xml:space="preserve"> Model 클래스에 glGenVertexArrays, glGenBuffers, glBindVertexArray, glBindBuffers, glBufferData, glVertexAttribPointer 등을 이용하여 VAO와 VBO를 사용하여 데이터를 GPU에 보내는 기능을 추가로 구현했다.</w:t>
-      </w:r>
-    </w:p>
-    <w:p>
-      <w:pPr>
-        <w:rPr>
-          <w:szCs w:val="22"/>
-        </w:rPr>
-      </w:pPr>
-      <w:r>
-        <w:rPr>
-          <w:rFonts w:hint="eastAsia"/>
-          <w:szCs w:val="22"/>
-        </w:rPr>
-        <w:t xml:space="preserve"> </w:t>
-      </w:r>
-      <w:r>
-        <w:rPr>
-          <w:szCs w:val="22"/>
-        </w:rPr>
-        <w:t xml:space="preserve">glm 관련 라이브러리를 include하여, 행렬 변환 및 포인터 변환 기능을 사용할 수 있게 하였으며, viewMatrix와 projMatrix를 </w:t>
-      </w:r>
-      <w:proofErr w:type="gramStart"/>
-      <w:r>
-        <w:rPr>
-          <w:szCs w:val="22"/>
-        </w:rPr>
-        <w:t>glm::</w:t>
-      </w:r>
-      <w:proofErr w:type="gramEnd"/>
-      <w:r>
-        <w:rPr>
-          <w:szCs w:val="22"/>
-        </w:rPr>
-        <w:t xml:space="preserve">mat4 타입의 전역 변수로 선언하였다. main에서 </w:t>
-      </w:r>
-      <w:proofErr w:type="gramStart"/>
-      <w:r>
-        <w:rPr>
-          <w:szCs w:val="22"/>
-        </w:rPr>
-        <w:t>glm::</w:t>
-      </w:r>
-      <w:proofErr w:type="gramEnd"/>
-      <w:r>
-        <w:rPr>
-          <w:szCs w:val="22"/>
-        </w:rPr>
-        <w:t>value_ptr을 이용하여 포인터를 넘긴다.</w:t>
-      </w:r>
-    </w:p>
-    <w:p>
-      <w:pPr>
-        <w:rPr>
-          <w:szCs w:val="22"/>
-        </w:rPr>
-      </w:pPr>
-      <w:r>
-        <w:rPr>
-          <w:rFonts w:hint="eastAsia"/>
-          <w:szCs w:val="22"/>
-        </w:rPr>
-        <w:t xml:space="preserve"> </w:t>
-      </w:r>
-      <w:r>
-        <w:rPr>
-          <w:rFonts w:hint="eastAsia"/>
-          <w:szCs w:val="22"/>
-        </w:rPr>
-        <w:t>기존</w:t>
-      </w:r>
-      <w:r>
-        <w:rPr>
-          <w:szCs w:val="22"/>
-        </w:rPr>
-        <w:t xml:space="preserve"> setGraphicStyle, setCameraViews 함수를 행렬을 이용하여 glm 버전으로 적절히 변경한다. 특히 setGraphicStyle 함수는 각 그래픽 스타일마다 적절히 그리기 위해, 렌더 기능까지 합쳐 setGraphicStyleThenRender라는 새로운 함수로 구현했다.</w:t>
-      </w:r>
-    </w:p>
-    <w:p>
-      <w:pPr>
-        <w:rPr>
-          <w:szCs w:val="22"/>
-        </w:rPr>
-      </w:pPr>
-      <w:r>
-        <w:rPr>
-          <w:rFonts w:hint="eastAsia"/>
-          <w:szCs w:val="22"/>
-        </w:rPr>
-        <w:t xml:space="preserve"> </w:t>
-      </w:r>
-      <w:r>
-        <w:rPr>
-          <w:rFonts w:hint="eastAsia"/>
-          <w:szCs w:val="22"/>
-        </w:rPr>
-        <w:t>그래픽</w:t>
-      </w:r>
-      <w:r>
-        <w:rPr>
-          <w:szCs w:val="22"/>
-        </w:rPr>
-        <w:t xml:space="preserve"> 스타일 중 이번 과제에 새로 추가해야 하는 wireframe style with hidden line removal은, 깊이 버퍼을 이용하여 검정색 면을 그린 후 그 다음에 선을 그려서, 검정색 면보다 뒤에 있는 선은 보이지 않게 하는 방식으로 구현할 수 있다. glPolygonOffset, glColorMask 등을 이용하면 된다.</w:t>
-      </w:r>
-    </w:p>
-    <w:p>
-      <w:pPr>
-        <w:rPr>
-          <w:szCs w:val="22"/>
-        </w:rPr>
-      </w:pPr>
-      <w:r>
-        <w:rPr>
-          <w:rFonts w:hint="eastAsia"/>
-          <w:szCs w:val="22"/>
-        </w:rPr>
-        <w:t xml:space="preserve"> </w:t>
-      </w:r>
-      <w:r>
-        <w:rPr>
-          <w:szCs w:val="22"/>
-        </w:rPr>
-        <w:t>Bounding box를 그리기 위한 데이터도 VAO, VBO로 미리 GPU에 보내 둔다. 선 12개, 즉 점 24개의 데이터가 필요하며 이는 InitBoundingBox 함수에서 관리한다.</w:t>
-      </w:r>
-    </w:p>
-    <w:p>
-      <w:pPr>
-        <w:rPr>
-          <w:szCs w:val="22"/>
-        </w:rPr>
-      </w:pPr>
-    </w:p>
-    <w:p>
-      <w:pPr>
-        <w:rPr>
-          <w:szCs w:val="22"/>
-        </w:rPr>
-      </w:pPr>
-    </w:p>
-    <w:p>
-      <w:pPr>
-        <w:rPr>
-          <w:szCs w:val="22"/>
-        </w:rPr>
-      </w:pPr>
-    </w:p>
-    <w:p>
-      <w:pPr>
-        <w:rPr>
-          <w:szCs w:val="22"/>
-        </w:rPr>
-      </w:pPr>
-    </w:p>
-    <w:p>
-      <w:pPr>
-        <w:rPr>
-          <w:rFonts w:hint="eastAsia"/>
-          <w:szCs w:val="22"/>
-        </w:rPr>
-      </w:pPr>
-    </w:p>
-    <w:p>
-      <w:pPr>
-        <w:rPr>
+      </w:pPr>
+      <w:r>
+        <w:rPr>
+          <w:rFonts w:hint="eastAsia"/>
           <w:b/>
           <w:bCs/>
           <w:sz w:val="24"/>
         </w:rPr>
-      </w:pPr>
-      <w:r>
-        <w:rPr>
-          <w:rFonts w:hint="eastAsia"/>
-          <w:b/>
-          <w:bCs/>
-          <w:sz w:val="24"/>
-        </w:rPr>
-        <w:lastRenderedPageBreak/>
         <w:t>2-5. Additonal Background</w:t>
       </w:r>
     </w:p>
     <w:p>
       <w:pPr>
         <w:rPr>
-          <w:szCs w:val="22"/>
-        </w:rPr>
-      </w:pPr>
-      <w:r>
-        <w:rPr>
-          <w:rFonts w:hint="eastAsia"/>
-          <w:szCs w:val="22"/>
-        </w:rPr>
-        <w:t xml:space="preserve"> 본 구현을 위해서는 OpenGL에서 3D 공간을 표현하는 방법, 그리고 씬 그래프 자료 구조</w:t>
-      </w:r>
-      <w:r>
-        <w:rPr>
-          <w:rFonts w:hint="eastAsia"/>
-          <w:szCs w:val="22"/>
-        </w:rPr>
-        <w:t xml:space="preserve"> 및 GLSL</w:t>
-      </w:r>
-      <w:r>
-        <w:rPr>
-          <w:rFonts w:hint="eastAsia"/>
-          <w:szCs w:val="22"/>
-        </w:rPr>
-        <w:t>에 대한 전반적인 이해가 필요했다.</w:t>
-      </w:r>
-    </w:p>
-    <w:p>
-      <w:pPr>
-        <w:rPr>
-          <w:szCs w:val="22"/>
-        </w:rPr>
-      </w:pPr>
-      <w:r>
-        <w:rPr>
-          <w:rFonts w:hint="eastAsia"/>
-          <w:szCs w:val="22"/>
-        </w:rPr>
-        <w:t xml:space="preserve">1) 3D 카메라 변환: 3D 공간을 2D 공간으로 표한하기 위해 두 가지 핵심적인 행렬 변환을 활용하였다. 첫번째는 카메라의 위치와 시점 방향을 설정하는 </w:t>
-      </w:r>
-      <w:r>
-        <w:rPr>
-          <w:rFonts w:hint="eastAsia"/>
-          <w:szCs w:val="22"/>
-        </w:rPr>
-        <w:t xml:space="preserve">시점 변환 </w:t>
-      </w:r>
-      <w:r>
-        <w:rPr>
-          <w:rFonts w:hint="eastAsia"/>
-          <w:szCs w:val="22"/>
-        </w:rPr>
-        <w:t>gluLookAt, 두번째는 3D 공간에 원근감을 부여하는</w:t>
-      </w:r>
-      <w:r>
-        <w:rPr>
-          <w:rFonts w:hint="eastAsia"/>
-          <w:szCs w:val="22"/>
-        </w:rPr>
-        <w:t xml:space="preserve"> 투영 변환 gluPerspective와 glOrtho였다. 이들을 구분해 적절하게 사용하면서 3D 공간을 바라보는 3가지 시점을 구현할 수 있었다.</w:t>
-      </w:r>
-    </w:p>
-    <w:p>
-      <w:pPr>
-        <w:rPr>
-          <w:szCs w:val="22"/>
-        </w:rPr>
-      </w:pPr>
-      <w:r>
-        <w:rPr>
-          <w:rFonts w:hint="eastAsia"/>
-          <w:szCs w:val="22"/>
-        </w:rPr>
-        <w:t>2) 계층적 씬 그래프: 엔티티들을 Node 그래프로 관리하기 위해 씬 그래프 자료구조를 활용하였다. 이 트리를 drawRecursive 함수가 glPushMatrix와 glPopMatrix를 사용해 행렬 상태를 관리하면서 재귀적으로 순회하며, 따라서 플레이어/적의 로컬 좌표계에서 공전하는 엔티티 등 계층적 움직임을 쉽게 구현할 수 있었다.</w:t>
-      </w:r>
-    </w:p>
-    <w:p>
-      <w:pPr>
-        <w:rPr>
-          <w:rFonts w:hint="eastAsia"/>
-          <w:szCs w:val="22"/>
-        </w:rPr>
-      </w:pPr>
-      <w:r>
-        <w:rPr>
-          <w:rFonts w:hint="eastAsia"/>
-          <w:szCs w:val="22"/>
-        </w:rPr>
-        <w:t xml:space="preserve">3) </w:t>
-      </w:r>
-      <w:r>
-        <w:rPr>
-          <w:rFonts w:hint="eastAsia"/>
-          <w:szCs w:val="22"/>
-        </w:rPr>
-        <w:t xml:space="preserve">GLSL: 이번 구현에서는 OpenGL의 legacy pipeline을 모두 Shading Language (GLSL)로 대체하며 렌더링 파이프라인을 변경하였다. Vertex Shader와 Fragment Shader를 컴파일 및 링크 함으로써 Shader 프로그램을 활성화하였고, </w:t>
-      </w:r>
-      <w:proofErr w:type="gramStart"/>
-      <w:r>
-        <w:rPr>
-          <w:rFonts w:hint="eastAsia"/>
-          <w:szCs w:val="22"/>
-        </w:rPr>
-        <w:t>Node::</w:t>
-      </w:r>
-      <w:proofErr w:type="gramEnd"/>
-      <w:r>
-        <w:rPr>
-          <w:rFonts w:hint="eastAsia"/>
-          <w:szCs w:val="22"/>
-        </w:rPr>
-        <w:t>drawRecursive 함수의 씬 그래프 순회 과정에서 모델 행렬, 뷰 행렬, 투영 행렬 및 오브젝트들의 색상을 셰이더의 Uniform 변수로 전송한다. 이 변수들은 GPU로 전달되고, GPU는 이 행렬들을 효율적으로 곱해 각 정점의 최종 화면 좌표 gl_Position을 계산하고 Fragment Shader가 objectColor를 받아 픽셀을 칠함으로써 렌더링 과정이 완료된다.</w:t>
-      </w:r>
-    </w:p>
-    <w:p>
-      <w:pPr>
-        <w:rPr>
-          <w:szCs w:val="22"/>
-        </w:rPr>
-      </w:pPr>
-    </w:p>
-    <w:p>
-      <w:pPr>
-        <w:rPr>
-          <w:rFonts w:hint="eastAsia"/>
           <w:szCs w:val="22"/>
         </w:rPr>
       </w:pPr>
@@ -1269,6 +545,7 @@
           <w:noProof/>
           <w:szCs w:val="22"/>
         </w:rPr>
+        <w:lastRenderedPageBreak/>
         <w:drawing>
           <wp:inline distT="0" distB="0" distL="0" distR="0" wp14:anchorId="6265E489" wp14:editId="517F90CD">
             <wp:extent cx="2201594" cy="648323"/>
@@ -1285,7 +562,7 @@
                     <pic:cNvPicPr/>
                   </pic:nvPicPr>
                   <pic:blipFill>
-                    <a:blip r:embed="rId5"/>
+                    <a:blip r:embed="rId7"/>
                     <a:stretch>
                       <a:fillRect/>
                     </a:stretch>
@@ -1347,7 +624,7 @@
                     <pic:cNvPicPr/>
                   </pic:nvPicPr>
                   <pic:blipFill>
-                    <a:blip r:embed="rId6"/>
+                    <a:blip r:embed="rId8"/>
                     <a:stretch>
                       <a:fillRect/>
                     </a:stretch>
@@ -1379,7 +656,6 @@
           <w:rFonts w:hint="eastAsia"/>
           <w:szCs w:val="22"/>
         </w:rPr>
-        <w:lastRenderedPageBreak/>
         <w:t>.\build.ps1을 입력한다.</w:t>
       </w:r>
     </w:p>
@@ -1410,7 +686,7 @@
                     <pic:cNvPicPr/>
                   </pic:nvPicPr>
                   <pic:blipFill>
-                    <a:blip r:embed="rId7"/>
+                    <a:blip r:embed="rId9"/>
                     <a:stretch>
                       <a:fillRect/>
                     </a:stretch>
@@ -1453,8 +729,10 @@
       </w:pPr>
       <w:r>
         <w:rPr>
-          <w:szCs w:val="22"/>
-        </w:rPr>
+          <w:noProof/>
+          <w:szCs w:val="22"/>
+        </w:rPr>
+        <w:lastRenderedPageBreak/>
         <w:drawing>
           <wp:inline distT="0" distB="0" distL="0" distR="0" wp14:anchorId="410756E4" wp14:editId="06FE8D3E">
             <wp:extent cx="4955780" cy="3894455"/>
@@ -1471,7 +749,7 @@
                     <pic:cNvPicPr/>
                   </pic:nvPicPr>
                   <pic:blipFill>
-                    <a:blip r:embed="rId8"/>
+                    <a:blip r:embed="rId10"/>
                     <a:stretch>
                       <a:fillRect/>
                     </a:stretch>
@@ -1495,7 +773,6 @@
     <w:p>
       <w:pPr>
         <w:rPr>
-          <w:rFonts w:hint="eastAsia"/>
           <w:szCs w:val="22"/>
         </w:rPr>
       </w:pPr>
@@ -1525,7 +802,6 @@
           <w:rFonts w:hint="eastAsia"/>
           <w:szCs w:val="22"/>
         </w:rPr>
-        <w:lastRenderedPageBreak/>
         <w:t>프로그램 종료 시 powershell 창에는 아래 메시지가 출력된다.</w:t>
       </w:r>
     </w:p>
@@ -1556,7 +832,7 @@
                     <pic:cNvPicPr/>
                   </pic:nvPicPr>
                   <pic:blipFill>
-                    <a:blip r:embed="rId9"/>
+                    <a:blip r:embed="rId11"/>
                     <a:stretch>
                       <a:fillRect/>
                     </a:stretch>
@@ -1668,7 +944,7 @@
                     <pic:cNvPicPr/>
                   </pic:nvPicPr>
                   <pic:blipFill>
-                    <a:blip r:embed="rId10"/>
+                    <a:blip r:embed="rId12"/>
                     <a:stretch>
                       <a:fillRect/>
                     </a:stretch>
@@ -1689,13 +965,7 @@
         </w:drawing>
       </w:r>
     </w:p>
-    <w:p>
-      <w:pPr>
-        <w:rPr>
-          <w:rFonts w:hint="eastAsia"/>
-        </w:rPr>
-      </w:pPr>
-    </w:p>
+    <w:p/>
     <w:p>
       <w:pPr>
         <w:rPr>
@@ -1735,20 +1005,16 @@
       </w:r>
     </w:p>
     <w:p>
-      <w:r>
-        <w:rPr>
-          <w:rFonts w:hint="eastAsia"/>
-        </w:rPr>
-        <w:t xml:space="preserve"> </w:t>
-      </w:r>
-      <w:r>
-        <w:rPr>
-          <w:rFonts w:hint="eastAsia"/>
-        </w:rPr>
-        <w:t>그래픽</w:t>
-      </w:r>
-      <w:r>
-        <w:t xml:space="preserve"> 스타일 중 wireframe style with hidden line removal의 경우, bounding box가 선으로 그려져서 보이지 않게 되는 문제가 있었다. 이는 기본값이 GL_LESS여서 그랬던 것으로, GL_LEQUAL로 바꾸니까 해결되었다.</w:t>
+      <w:pPr>
+        <w:rPr>
+          <w:rFonts w:hint="eastAsia"/>
+        </w:rPr>
+      </w:pPr>
+      <w:r>
+        <w:rPr>
+          <w:rFonts w:hint="eastAsia"/>
+        </w:rPr>
+        <w:t xml:space="preserve"> additional goal 중 planar shadow casting을 구현할 때, 그냥 행렬만 만들었더니 오브젝트들의 그림자가 회전하는 point light의 빛을 받아 생겨서 바닥이 아닌 천장 쪽에서 회전하는 현상이 발생했었다. 또한, bounding box에도 그림자가 생기는 문제가 있었다. 이를 해결하기 위해 그림자를 그리기 전 bounding box를 잠깐 숨기고, point light 대신 planar shadow만을 위한 조명을 하나 새로 선언하였다.</w:t>
       </w:r>
     </w:p>
     <w:p>
@@ -1772,23 +1038,11 @@
     <w:p>
       <w:pPr>
         <w:rPr>
-          <w:szCs w:val="22"/>
-        </w:rPr>
-      </w:pPr>
-      <w:r>
-        <w:rPr>
-          <w:rFonts w:hint="eastAsia"/>
-          <w:szCs w:val="22"/>
-        </w:rPr>
-        <w:t xml:space="preserve"> Assignment 문서에서 제시되었던 Destructible enemy parts를 </w:t>
-      </w:r>
-      <w:r>
-        <w:rPr>
-          <w:rFonts w:hint="eastAsia"/>
-          <w:szCs w:val="22"/>
-        </w:rPr>
-        <w:t>추가적으로 구현하면 게임 플레이어가 조금 더 슈팅 게임이라는 게임 장르에 몰입할 수 있을 것이다. 또한 현재 적의 움직임은 굉장히 단순한데, 공격 패턴이나 이동 패턴 등을 더 다양하게 설계한다면 게임성을 높일 수 있다.</w:t>
-      </w:r>
+          <w:b/>
+          <w:bCs/>
+          <w:szCs w:val="22"/>
+        </w:rPr>
+      </w:pPr>
     </w:p>
     <w:p>
       <w:pPr>
@@ -1806,26 +1060,6 @@
           <w:sz w:val="24"/>
         </w:rPr>
         <w:t>4-3. Lessons</w:t>
-      </w:r>
-    </w:p>
-    <w:p>
-      <w:pPr>
-        <w:rPr>
-          <w:szCs w:val="22"/>
-        </w:rPr>
-      </w:pPr>
-      <w:r>
-        <w:rPr>
-          <w:rFonts w:hint="eastAsia"/>
-          <w:szCs w:val="22"/>
-        </w:rPr>
-        <w:t xml:space="preserve"> </w:t>
-      </w:r>
-      <w:r>
-        <w:rPr>
-          <w:szCs w:val="22"/>
-        </w:rPr>
-        <w:t>GLSL과 프로그램 전체에서 쓰이는 행렬을 이용하여 3D 그래픽을 구현하는 방법을 과제를 통해 직접 구현하며 체화할 수 있었다.</w:t>
       </w:r>
     </w:p>
     <w:p>
@@ -1852,7 +1086,6 @@
           <w:sz w:val="32"/>
           <w:szCs w:val="32"/>
         </w:rPr>
-        <w:lastRenderedPageBreak/>
         <w:t>5. References</w:t>
       </w:r>
     </w:p>
@@ -1987,7 +1220,6 @@
     <w:p>
       <w:pPr>
         <w:rPr>
-          <w:rFonts w:hint="eastAsia"/>
           <w:szCs w:val="22"/>
         </w:rPr>
       </w:pPr>
@@ -2014,6 +1246,56 @@
     </w:sectPr>
   </w:body>
 </w:document>
+</file>
+
+<file path=word/endnotes.xml><?xml version="1.0" encoding="utf-8"?>
+<w:endnotes xmlns:wpc="http://schemas.microsoft.com/office/word/2010/wordprocessingCanvas" xmlns:cx="http://schemas.microsoft.com/office/drawing/2014/chartex" xmlns:cx1="http://schemas.microsoft.com/office/drawing/2015/9/8/chartex" xmlns:cx2="http://schemas.microsoft.com/office/drawing/2015/10/21/chartex" xmlns:cx3="http://schemas.microsoft.com/office/drawing/2016/5/9/chartex" xmlns:cx4="http://schemas.microsoft.com/office/drawing/2016/5/10/chartex" xmlns:cx5="http://schemas.microsoft.com/office/drawing/2016/5/11/chartex" xmlns:cx6="http://schemas.microsoft.com/office/drawing/2016/5/12/chartex" xmlns:cx7="http://schemas.microsoft.com/office/drawing/2016/5/13/chartex" xmlns:cx8="http://schemas.microsoft.com/office/drawing/2016/5/14/chartex" xmlns:mc="http://schemas.openxmlformats.org/markup-compatibility/2006" xmlns:aink="http://schemas.microsoft.com/office/drawing/2016/ink" xmlns:am3d="http://schemas.microsoft.com/office/drawing/2017/model3d" xmlns:o="urn:schemas-microsoft-com:office:office" xmlns:oel="http://schemas.microsoft.com/office/2019/extlst" xmlns:r="http://schemas.openxmlformats.org/officeDocument/2006/relationships" xmlns:m="http://schemas.openxmlformats.org/officeDocument/2006/math" xmlns:v="urn:schemas-microsoft-com:vml" xmlns:wp14="http://schemas.microsoft.com/office/word/2010/wordprocessingDrawing" xmlns:wp="http://schemas.openxmlformats.org/drawingml/2006/wordprocessingDrawing" xmlns:w10="urn:schemas-microsoft-com:office:word" xmlns:w="http://schemas.openxmlformats.org/wordprocessingml/2006/main" xmlns:w14="http://schemas.microsoft.com/office/word/2010/wordml" xmlns:w15="http://schemas.microsoft.com/office/word/2012/wordml" xmlns:w16cex="http://schemas.microsoft.com/office/word/2018/wordml/cex" xmlns:w16cid="http://schemas.microsoft.com/office/word/2016/wordml/cid" xmlns:w16="http://schemas.microsoft.com/office/word/2018/wordml" xmlns:w16du="http://schemas.microsoft.com/office/word/2023/wordml/word16du" xmlns:w16sdtdh="http://schemas.microsoft.com/office/word/2020/wordml/sdtdatahash" xmlns:w16sdtfl="http://schemas.microsoft.com/office/word/2024/wordml/sdtformatlock" xmlns:w16se="http://schemas.microsoft.com/office/word/2015/wordml/symex" xmlns:wpg="http://schemas.microsoft.com/office/word/2010/wordprocessingGroup" xmlns:wpi="http://schemas.microsoft.com/office/word/2010/wordprocessingInk" xmlns:wne="http://schemas.microsoft.com/office/word/2006/wordml" xmlns:wps="http://schemas.microsoft.com/office/word/2010/wordprocessingShape" mc:Ignorable="w14 w15 w16se w16cid w16 w16cex w16sdtdh w16sdtfl w16du wp14">
+  <w:endnote w:type="separator" w:id="-1">
+    <w:p>
+      <w:pPr>
+        <w:spacing w:after="0"/>
+      </w:pPr>
+      <w:r>
+        <w:separator/>
+      </w:r>
+    </w:p>
+  </w:endnote>
+  <w:endnote w:type="continuationSeparator" w:id="0">
+    <w:p>
+      <w:pPr>
+        <w:spacing w:after="0"/>
+      </w:pPr>
+      <w:r>
+        <w:continuationSeparator/>
+      </w:r>
+    </w:p>
+  </w:endnote>
+</w:endnotes>
+</file>
+
+<file path=word/footnotes.xml><?xml version="1.0" encoding="utf-8"?>
+<w:footnotes xmlns:wpc="http://schemas.microsoft.com/office/word/2010/wordprocessingCanvas" xmlns:cx="http://schemas.microsoft.com/office/drawing/2014/chartex" xmlns:cx1="http://schemas.microsoft.com/office/drawing/2015/9/8/chartex" xmlns:cx2="http://schemas.microsoft.com/office/drawing/2015/10/21/chartex" xmlns:cx3="http://schemas.microsoft.com/office/drawing/2016/5/9/chartex" xmlns:cx4="http://schemas.microsoft.com/office/drawing/2016/5/10/chartex" xmlns:cx5="http://schemas.microsoft.com/office/drawing/2016/5/11/chartex" xmlns:cx6="http://schemas.microsoft.com/office/drawing/2016/5/12/chartex" xmlns:cx7="http://schemas.microsoft.com/office/drawing/2016/5/13/chartex" xmlns:cx8="http://schemas.microsoft.com/office/drawing/2016/5/14/chartex" xmlns:mc="http://schemas.openxmlformats.org/markup-compatibility/2006" xmlns:aink="http://schemas.microsoft.com/office/drawing/2016/ink" xmlns:am3d="http://schemas.microsoft.com/office/drawing/2017/model3d" xmlns:o="urn:schemas-microsoft-com:office:office" xmlns:oel="http://schemas.microsoft.com/office/2019/extlst" xmlns:r="http://schemas.openxmlformats.org/officeDocument/2006/relationships" xmlns:m="http://schemas.openxmlformats.org/officeDocument/2006/math" xmlns:v="urn:schemas-microsoft-com:vml" xmlns:wp14="http://schemas.microsoft.com/office/word/2010/wordprocessingDrawing" xmlns:wp="http://schemas.openxmlformats.org/drawingml/2006/wordprocessingDrawing" xmlns:w10="urn:schemas-microsoft-com:office:word" xmlns:w="http://schemas.openxmlformats.org/wordprocessingml/2006/main" xmlns:w14="http://schemas.microsoft.com/office/word/2010/wordml" xmlns:w15="http://schemas.microsoft.com/office/word/2012/wordml" xmlns:w16cex="http://schemas.microsoft.com/office/word/2018/wordml/cex" xmlns:w16cid="http://schemas.microsoft.com/office/word/2016/wordml/cid" xmlns:w16="http://schemas.microsoft.com/office/word/2018/wordml" xmlns:w16du="http://schemas.microsoft.com/office/word/2023/wordml/word16du" xmlns:w16sdtdh="http://schemas.microsoft.com/office/word/2020/wordml/sdtdatahash" xmlns:w16sdtfl="http://schemas.microsoft.com/office/word/2024/wordml/sdtformatlock" xmlns:w16se="http://schemas.microsoft.com/office/word/2015/wordml/symex" xmlns:wpg="http://schemas.microsoft.com/office/word/2010/wordprocessingGroup" xmlns:wpi="http://schemas.microsoft.com/office/word/2010/wordprocessingInk" xmlns:wne="http://schemas.microsoft.com/office/word/2006/wordml" xmlns:wps="http://schemas.microsoft.com/office/word/2010/wordprocessingShape" mc:Ignorable="w14 w15 w16se w16cid w16 w16cex w16sdtdh w16sdtfl w16du wp14">
+  <w:footnote w:type="separator" w:id="-1">
+    <w:p>
+      <w:pPr>
+        <w:spacing w:after="0"/>
+      </w:pPr>
+      <w:r>
+        <w:separator/>
+      </w:r>
+    </w:p>
+  </w:footnote>
+  <w:footnote w:type="continuationSeparator" w:id="0">
+    <w:p>
+      <w:pPr>
+        <w:spacing w:after="0"/>
+      </w:pPr>
+      <w:r>
+        <w:continuationSeparator/>
+      </w:r>
+    </w:p>
+  </w:footnote>
+</w:footnotes>
 </file>
 
 <file path=word/numbering.xml><?xml version="1.0" encoding="utf-8"?>
@@ -2812,6 +2094,7 @@
   <w:style w:type="character" w:default="1" w:styleId="a0">
     <w:name w:val="Default Paragraph Font"/>
     <w:uiPriority w:val="1"/>
+    <w:semiHidden/>
     <w:unhideWhenUsed/>
   </w:style>
   <w:style w:type="table" w:default="1" w:styleId="a1">
@@ -3119,6 +2402,50 @@
       <w:color w:val="0F4761" w:themeColor="accent1" w:themeShade="BF"/>
       <w:spacing w:val="5"/>
     </w:rPr>
+  </w:style>
+  <w:style w:type="paragraph" w:styleId="aa">
+    <w:name w:val="header"/>
+    <w:basedOn w:val="a"/>
+    <w:link w:val="Char3"/>
+    <w:uiPriority w:val="99"/>
+    <w:unhideWhenUsed/>
+    <w:rsid w:val="00426B3E"/>
+    <w:pPr>
+      <w:tabs>
+        <w:tab w:val="center" w:pos="4513"/>
+        <w:tab w:val="right" w:pos="9026"/>
+      </w:tabs>
+      <w:snapToGrid w:val="0"/>
+    </w:pPr>
+  </w:style>
+  <w:style w:type="character" w:customStyle="1" w:styleId="Char3">
+    <w:name w:val="머리글 Char"/>
+    <w:basedOn w:val="a0"/>
+    <w:link w:val="aa"/>
+    <w:uiPriority w:val="99"/>
+    <w:rsid w:val="00426B3E"/>
+  </w:style>
+  <w:style w:type="paragraph" w:styleId="ab">
+    <w:name w:val="footer"/>
+    <w:basedOn w:val="a"/>
+    <w:link w:val="Char4"/>
+    <w:uiPriority w:val="99"/>
+    <w:unhideWhenUsed/>
+    <w:rsid w:val="00426B3E"/>
+    <w:pPr>
+      <w:tabs>
+        <w:tab w:val="center" w:pos="4513"/>
+        <w:tab w:val="right" w:pos="9026"/>
+      </w:tabs>
+      <w:snapToGrid w:val="0"/>
+    </w:pPr>
+  </w:style>
+  <w:style w:type="character" w:customStyle="1" w:styleId="Char4">
+    <w:name w:val="바닥글 Char"/>
+    <w:basedOn w:val="a0"/>
+    <w:link w:val="ab"/>
+    <w:uiPriority w:val="99"/>
+    <w:rsid w:val="00426B3E"/>
   </w:style>
 </w:styles>
 </file>

</xml_diff>